<commit_message>
Update documentation with actual Docker evidence
</commit_message>
<xml_diff>
--- a/Docker_Tanishk_Singh_Documentation.docx
+++ b/Docker_Tanishk_Singh_Documentation.docx
@@ -9,9 +9,10 @@
       <w:r>
         <w:rPr>
           <w:b/>
-          <w:sz w:val="44"/>
+          <w:color w:val="162B44"/>
+          <w:sz w:val="48"/>
         </w:rPr>
-        <w:t>Docker — DevOps Assignment</w:t>
+        <w:t>DOCKER — DEVOPS ASSIGNMENT</w:t>
       </w:r>
     </w:p>
     <w:p>
@@ -20,11 +21,21 @@
       </w:pPr>
       <w:r>
         <w:rPr>
-          <w:b/>
+          <w:color w:val="105C68"/>
+          <w:sz w:val="28"/>
         </w:rPr>
         <w:t>Node.js / Express Frontend + Flask Backend</w:t>
-        <w:br/>
-        <w:t>Prepared for Tanishk Singh</w:t>
+      </w:r>
+    </w:p>
+    <w:p>
+      <w:pPr>
+        <w:jc w:val="center"/>
+      </w:pPr>
+      <w:r>
+        <w:rPr>
+          <w:i/>
+        </w:rPr>
+        <w:t>Prepared by Tanishk Singh</w:t>
       </w:r>
     </w:p>
     <w:p>
@@ -37,7 +48,7 @@
     </w:p>
     <w:p>
       <w:r>
-        <w:t>The assignment requires a Node.js/Express frontend and a Flask backend, each with a Dockerfile, connected by Docker Compose on one network, with source pushed to GitHub and images uploaded to Docker Hub.</w:t>
+        <w:t>Containerize a full-stack application with a Node.js/Express frontend and a Flask backend. Each service has its own Dockerfile; Docker Compose connects both services on a shared network. The source code is published to GitHub and both container images are published to Docker Hub.</w:t>
       </w:r>
     </w:p>
     <w:p>
@@ -45,12 +56,39 @@
         <w:pStyle w:val="Heading1"/>
       </w:pPr>
       <w:r>
-        <w:t>2. Frontend</w:t>
+        <w:t>2. Application architecture</w:t>
       </w:r>
     </w:p>
     <w:p>
+      <w:pPr>
+        <w:pStyle w:val="ListBullet"/>
+      </w:pPr>
       <w:r>
-        <w:t>The Express frontend serves a form with name, email and message fields. Its /submit route forwards the form as JSON to the Flask service using the Compose DNS hostname http://backend:5000. It renders success and error feedback.</w:t>
+        <w:t>Frontend: Node.js and Express serves a form with name, email, and message fields on port 3000.</w:t>
+      </w:r>
+    </w:p>
+    <w:p>
+      <w:pPr>
+        <w:pStyle w:val="ListBullet"/>
+      </w:pPr>
+      <w:r>
+        <w:t>Backend: Flask exposes POST /api/submit for validating and processing form data and GET /health for a health check.</w:t>
+      </w:r>
+    </w:p>
+    <w:p>
+      <w:pPr>
+        <w:pStyle w:val="ListBullet"/>
+      </w:pPr>
+      <w:r>
+        <w:t>Networking: The frontend calls http://backend:5000 using the backend service name provided by Docker Compose.</w:t>
+      </w:r>
+    </w:p>
+    <w:p>
+      <w:pPr>
+        <w:pStyle w:val="ListBullet"/>
+      </w:pPr>
+      <w:r>
+        <w:t>Compose: Both services are attached to the assignment-network bridge network; ports 3000 and 5000 are mapped to the host.</w:t>
       </w:r>
     </w:p>
     <w:p>
@@ -58,12 +96,56 @@
         <w:pStyle w:val="Heading1"/>
       </w:pPr>
       <w:r>
-        <w:t>3. Backend</w:t>
+        <w:t>3. Run and verify locally</w:t>
       </w:r>
     </w:p>
     <w:p>
       <w:r>
-        <w:t>The Flask API exposes POST /api/submit to validate and process form data and GET /health for a health check.</w:t>
+        <w:t>From PowerShell in the project directory, run:</w:t>
+      </w:r>
+    </w:p>
+    <w:p>
+      <w:pPr>
+        <w:ind w:left="360"/>
+      </w:pPr>
+      <w:r>
+        <w:rPr>
+          <w:rFonts w:ascii="Consolas" w:hAnsi="Consolas"/>
+          <w:color w:val="23415C"/>
+          <w:sz w:val="18"/>
+        </w:rPr>
+        <w:t>docker compose up --build -d</w:t>
+      </w:r>
+    </w:p>
+    <w:p>
+      <w:pPr>
+        <w:ind w:left="360"/>
+      </w:pPr>
+      <w:r>
+        <w:rPr>
+          <w:rFonts w:ascii="Consolas" w:hAnsi="Consolas"/>
+          <w:color w:val="23415C"/>
+          <w:sz w:val="18"/>
+        </w:rPr>
+        <w:t>docker compose ps</w:t>
+      </w:r>
+    </w:p>
+    <w:p>
+      <w:pPr>
+        <w:ind w:left="360"/>
+      </w:pPr>
+      <w:r>
+        <w:rPr>
+          <w:rFonts w:ascii="Consolas" w:hAnsi="Consolas"/>
+          <w:color w:val="23415C"/>
+          <w:sz w:val="18"/>
+        </w:rPr>
+        <w:t>Invoke-RestMethod http://localhost:5000/health</w:t>
+      </w:r>
+    </w:p>
+    <w:p>
+      <w:r>
+        <w:t>Verification completed: both Compose services reported an Up status, the Flask health endpoint returned service = flask-backend and status = ok, and submitting the form displayed a success page confirming that the Flask backend received the data.</w:t>
       </w:r>
     </w:p>
     <w:p>
@@ -71,107 +153,27 @@
         <w:pStyle w:val="Heading1"/>
       </w:pPr>
       <w:r>
-        <w:t>4. Docker configuration</w:t>
+        <w:t>4. Actual execution evidence</w:t>
       </w:r>
     </w:p>
     <w:p>
       <w:r>
-        <w:t>Separate Dockerfiles build the Node.js and Python services. docker-compose.yml maps ports 3000 and 5000 and attaches both services to the assignment-network bridge network. The frontend addresses the backend by service name, not localhost.</w:t>
+        <w:t>The screenshots below were captured during the actual local run. They replace the illustrative sample images from the earlier draft.</w:t>
       </w:r>
     </w:p>
     <w:p>
       <w:pPr>
-        <w:pStyle w:val="Heading1"/>
+        <w:pStyle w:val="Heading2"/>
       </w:pPr>
       <w:r>
-        <w:t>5. Run instructions</w:t>
-      </w:r>
-    </w:p>
-    <w:p>
-      <w:pPr>
-        <w:pStyle w:val="ListNumber"/>
-      </w:pPr>
-      <w:r>
-        <w:t>Install and start Docker Desktop.</w:t>
-      </w:r>
-    </w:p>
-    <w:p>
-      <w:pPr>
-        <w:pStyle w:val="ListNumber"/>
-      </w:pPr>
-      <w:r>
-        <w:t>Open PowerShell in the project directory.</w:t>
-      </w:r>
-    </w:p>
-    <w:p>
-      <w:pPr>
-        <w:pStyle w:val="ListNumber"/>
-      </w:pPr>
-      <w:r>
-        <w:t>Run: docker compose up --build -d</w:t>
-      </w:r>
-    </w:p>
-    <w:p>
-      <w:pPr>
-        <w:pStyle w:val="ListNumber"/>
-      </w:pPr>
-      <w:r>
-        <w:t>Check: docker compose ps</w:t>
-      </w:r>
-    </w:p>
-    <w:p>
-      <w:pPr>
-        <w:pStyle w:val="ListNumber"/>
-      </w:pPr>
-      <w:r>
-        <w:t>Open http://localhost:3000 and submit the form.</w:t>
-      </w:r>
-    </w:p>
-    <w:p>
-      <w:pPr>
-        <w:pStyle w:val="ListNumber"/>
-      </w:pPr>
-      <w:r>
-        <w:t>Verify health endpoints at localhost:3000/health and localhost:5000/health.</w:t>
-      </w:r>
-    </w:p>
-    <w:p>
-      <w:pPr>
-        <w:pStyle w:val="ListNumber"/>
-      </w:pPr>
-      <w:r>
-        <w:t>Inspect logs with docker compose logs --tail=100.</w:t>
-      </w:r>
-    </w:p>
-    <w:p>
-      <w:pPr>
-        <w:pStyle w:val="ListNumber"/>
-      </w:pPr>
-      <w:r>
-        <w:t>Stop with docker compose down.</w:t>
-      </w:r>
-    </w:p>
-    <w:p>
-      <w:pPr>
-        <w:pStyle w:val="Heading1"/>
-      </w:pPr>
-      <w:r>
-        <w:t>6. Illustrative command screenshots</w:t>
+        <w:t>4.1 Frontend form</w:t>
       </w:r>
     </w:p>
     <w:p>
       <w:r>
-        <w:t>These images are labeled samples, not genuine execution evidence. After running Docker locally, replace them with actual screenshots of Compose startup, running containers, successful form submission, and Docker Hub repositories after publishing.</w:t>
-      </w:r>
-    </w:p>
-    <w:p>
-      <w:pPr>
-        <w:jc w:val="center"/>
-      </w:pPr>
-      <w:r>
         <w:drawing>
           <wp:inline xmlns:a="http://schemas.openxmlformats.org/drawingml/2006/main" xmlns:pic="http://schemas.openxmlformats.org/drawingml/2006/picture">
-            <wp:extent cx="5669280" cy="2929128"/>
+            <wp:extent cx="6217920" cy="3852508"/>
             <wp:docPr id="1" name="Picture 1"/>
             <wp:cNvGraphicFramePr>
               <a:graphicFrameLocks noChangeAspect="1"/>
@@ -180,7 +182,7 @@
               <a:graphicData uri="http://schemas.openxmlformats.org/drawingml/2006/picture">
                 <pic:pic>
                   <pic:nvPicPr>
-                    <pic:cNvPr id="0" name="sample_compose_start.png"/>
+                    <pic:cNvPr id="0" name="form.png"/>
                     <pic:cNvPicPr/>
                   </pic:nvPicPr>
                   <pic:blipFill>
@@ -192,7 +194,7 @@
                   <pic:spPr>
                     <a:xfrm>
                       <a:off x="0" y="0"/>
-                      <a:ext cx="5669280" cy="2929128"/>
+                      <a:ext cx="6217920" cy="3852508"/>
                     </a:xfrm>
                     <a:prstGeom prst="rect"/>
                   </pic:spPr>
@@ -208,17 +210,27 @@
         <w:jc w:val="center"/>
       </w:pPr>
       <w:r>
-        <w:t>Sample 1 — expected Compose startup output.</w:t>
+        <w:rPr>
+          <w:i/>
+          <w:color w:val="505A69"/>
+          <w:sz w:val="18"/>
+        </w:rPr>
+        <w:t>Figure 1. The Node.js/Express form running locally at port 3000.</w:t>
       </w:r>
     </w:p>
     <w:p>
       <w:pPr>
-        <w:jc w:val="center"/>
+        <w:pStyle w:val="Heading2"/>
       </w:pPr>
+      <w:r>
+        <w:t>4.2 Successful submission</w:t>
+      </w:r>
+    </w:p>
+    <w:p>
       <w:r>
         <w:drawing>
           <wp:inline xmlns:a="http://schemas.openxmlformats.org/drawingml/2006/main" xmlns:pic="http://schemas.openxmlformats.org/drawingml/2006/picture">
-            <wp:extent cx="5669280" cy="2929128"/>
+            <wp:extent cx="6217920" cy="2287373"/>
             <wp:docPr id="2" name="Picture 2"/>
             <wp:cNvGraphicFramePr>
               <a:graphicFrameLocks noChangeAspect="1"/>
@@ -227,7 +239,7 @@
               <a:graphicData uri="http://schemas.openxmlformats.org/drawingml/2006/picture">
                 <pic:pic>
                   <pic:nvPicPr>
-                    <pic:cNvPr id="0" name="sample_health_checks.png"/>
+                    <pic:cNvPr id="0" name="submission_success.png"/>
                     <pic:cNvPicPr/>
                   </pic:nvPicPr>
                   <pic:blipFill>
@@ -239,7 +251,7 @@
                   <pic:spPr>
                     <a:xfrm>
                       <a:off x="0" y="0"/>
-                      <a:ext cx="5669280" cy="2929128"/>
+                      <a:ext cx="6217920" cy="2287373"/>
                     </a:xfrm>
                     <a:prstGeom prst="rect"/>
                   </pic:spPr>
@@ -255,17 +267,27 @@
         <w:jc w:val="center"/>
       </w:pPr>
       <w:r>
-        <w:t>Sample 2 — expected health-check responses.</w:t>
+        <w:rPr>
+          <w:i/>
+          <w:color w:val="505A69"/>
+          <w:sz w:val="18"/>
+        </w:rPr>
+        <w:t>Figure 2. The frontend confirms that the Flask backend received the submitted data.</w:t>
       </w:r>
     </w:p>
     <w:p>
       <w:pPr>
-        <w:jc w:val="center"/>
+        <w:pStyle w:val="Heading2"/>
       </w:pPr>
+      <w:r>
+        <w:t>4.3 Containers and backend health check</w:t>
+      </w:r>
+    </w:p>
+    <w:p>
       <w:r>
         <w:drawing>
           <wp:inline xmlns:a="http://schemas.openxmlformats.org/drawingml/2006/main" xmlns:pic="http://schemas.openxmlformats.org/drawingml/2006/picture">
-            <wp:extent cx="5669280" cy="2929128"/>
+            <wp:extent cx="6217920" cy="1527208"/>
             <wp:docPr id="3" name="Picture 3"/>
             <wp:cNvGraphicFramePr>
               <a:graphicFrameLocks noChangeAspect="1"/>
@@ -274,7 +296,7 @@
               <a:graphicData uri="http://schemas.openxmlformats.org/drawingml/2006/picture">
                 <pic:pic>
                   <pic:nvPicPr>
-                    <pic:cNvPr id="0" name="sample_dockerhub_push.png"/>
+                    <pic:cNvPr id="0" name="docker_compose_ps_and_health.png"/>
                     <pic:cNvPicPr/>
                   </pic:nvPicPr>
                   <pic:blipFill>
@@ -286,7 +308,7 @@
                   <pic:spPr>
                     <a:xfrm>
                       <a:off x="0" y="0"/>
-                      <a:ext cx="5669280" cy="2929128"/>
+                      <a:ext cx="6217920" cy="1527208"/>
                     </a:xfrm>
                     <a:prstGeom prst="rect"/>
                   </pic:spPr>
@@ -302,7 +324,12 @@
         <w:jc w:val="center"/>
       </w:pPr>
       <w:r>
-        <w:t>Sample 3 — illustrative Docker Hub push output.</w:t>
+        <w:rPr>
+          <w:i/>
+          <w:color w:val="505A69"/>
+          <w:sz w:val="18"/>
+        </w:rPr>
+        <w:t>Figure 3. Docker Compose shows both services running; the Flask health endpoint returns ok.</w:t>
       </w:r>
     </w:p>
     <w:p>
@@ -310,12 +337,69 @@
         <w:pStyle w:val="Heading1"/>
       </w:pPr>
       <w:r>
-        <w:t>7. Publish images to Docker Hub</w:t>
+        <w:t>5. Docker Hub publication</w:t>
       </w:r>
     </w:p>
     <w:p>
       <w:r>
-        <w:t>Create the two repositories in your Docker Hub account and run the build/push commands in README.md using your username. This cannot be completed without your Docker Hub login/account.</w:t>
+        <w:t>Both images were pushed to Docker Hub under the account tanishk111:</w:t>
+      </w:r>
+    </w:p>
+    <w:p>
+      <w:pPr>
+        <w:pStyle w:val="ListBullet"/>
+      </w:pPr>
+      <w:r>
+        <w:rPr>
+          <w:b/>
+        </w:rPr>
+        <w:t xml:space="preserve">Flask backend: </w:t>
+      </w:r>
+      <w:r>
+        <w:t>https://hub.docker.com/r/tanishk111/tutedude-flask-backend</w:t>
+      </w:r>
+    </w:p>
+    <w:p>
+      <w:pPr>
+        <w:pStyle w:val="ListBullet"/>
+      </w:pPr>
+      <w:r>
+        <w:rPr>
+          <w:b/>
+        </w:rPr>
+        <w:t xml:space="preserve">Node.js frontend: </w:t>
+      </w:r>
+      <w:r>
+        <w:t>https://hub.docker.com/r/tanishk111/tutedude-node-frontend</w:t>
+      </w:r>
+    </w:p>
+    <w:p>
+      <w:r>
+        <w:t>Image names:</w:t>
+      </w:r>
+    </w:p>
+    <w:p>
+      <w:pPr>
+        <w:pStyle w:val="ListBullet"/>
+      </w:pPr>
+      <w:r>
+        <w:rPr>
+          <w:rFonts w:ascii="Consolas" w:hAnsi="Consolas"/>
+          <w:sz w:val="18"/>
+        </w:rPr>
+        <w:t>tanishk111/tutedude-flask-backend:latest</w:t>
+      </w:r>
+    </w:p>
+    <w:p>
+      <w:pPr>
+        <w:pStyle w:val="ListBullet"/>
+      </w:pPr>
+      <w:r>
+        <w:rPr>
+          <w:rFonts w:ascii="Consolas" w:hAnsi="Consolas"/>
+          <w:sz w:val="18"/>
+        </w:rPr>
+        <w:t>tanishk111/tutedude-node-frontend:latest</w:t>
       </w:r>
     </w:p>
     <w:p>
@@ -323,12 +407,17 @@
         <w:pStyle w:val="Heading1"/>
       </w:pPr>
       <w:r>
-        <w:t>8. Push code to GitHub</w:t>
+        <w:t>6. GitHub publication</w:t>
       </w:r>
     </w:p>
     <w:p>
       <w:r>
-        <w:t>Create Docker_Tanishk_Singh on GitHub and run the commands in README.md. Replace the username placeholder and add the real repository URL after the push.</w:t>
+        <w:t>Project repository: https://github.com/tanishk162del-create/Docker_Tanishk_Singh</w:t>
+      </w:r>
+    </w:p>
+    <w:p>
+      <w:r>
+        <w:t>The repository contains the frontend and backend source code, their Dockerfiles, docker-compose.yml, README.md, .gitignore, documentation, and actual local execution screenshots.</w:t>
       </w:r>
     </w:p>
     <w:p>
@@ -336,7 +425,7 @@
         <w:pStyle w:val="Heading1"/>
       </w:pPr>
       <w:r>
-        <w:t>9. Submission checklist</w:t>
+        <w:t>7. Submission checklist</w:t>
       </w:r>
     </w:p>
     <w:p>
@@ -368,7 +457,7 @@
         <w:pStyle w:val="ListBullet"/>
       </w:pPr>
       <w:r>
-        <w:t>Docker Compose connects services on a shared network.</w:t>
+        <w:t>Docker Compose connects both services on a shared network.</w:t>
       </w:r>
     </w:p>
     <w:p>
@@ -376,7 +465,7 @@
         <w:pStyle w:val="ListBullet"/>
       </w:pPr>
       <w:r>
-        <w:t>.gitignore excludes node_modules, .env, caches and editor files.</w:t>
+        <w:t>.gitignore excludes .env, node_modules, caches, and editor files.</w:t>
       </w:r>
     </w:p>
     <w:p>
@@ -384,7 +473,7 @@
         <w:pStyle w:val="ListBullet"/>
       </w:pPr>
       <w:r>
-        <w:t>Documentation and labeled sample illustrations included.</w:t>
+        <w:t>Actual frontend, submission, container status, and health-check screenshots included.</w:t>
       </w:r>
     </w:p>
     <w:p>
@@ -392,12 +481,33 @@
         <w:pStyle w:val="ListBullet"/>
       </w:pPr>
       <w:r>
-        <w:t>Actual Docker screenshots and Docker Hub/GitHub publishing still require the local run and personal accounts.</w:t>
+        <w:t>Both Docker images published to Docker Hub.</w:t>
+      </w:r>
+    </w:p>
+    <w:p>
+      <w:pPr>
+        <w:pStyle w:val="ListBullet"/>
+      </w:pPr>
+      <w:r>
+        <w:t>Project source pushed to GitHub.</w:t>
+      </w:r>
+    </w:p>
+    <w:p>
+      <w:pPr>
+        <w:pStyle w:val="Heading1"/>
+      </w:pPr>
+      <w:r>
+        <w:t>8. Security note</w:t>
+      </w:r>
+    </w:p>
+    <w:p>
+      <w:r>
+        <w:t>Credentials and Docker Hub access tokens must remain private and must not be included in this submission. The .env file is excluded by .gitignore; only .env.example is included.</w:t>
       </w:r>
     </w:p>
     <w:sectPr>
       <w:pgSz w:w="12240" w:h="15840"/>
-      <w:pgMar w:top="1440" w:right="1800" w:bottom="1440" w:left="1800" w:header="720" w:footer="720" w:gutter="0"/>
+      <w:pgMar w:top="936" w:right="1080" w:bottom="936" w:left="1080" w:header="720" w:footer="720" w:gutter="0"/>
       <w:cols w:space="720"/>
       <w:docGrid w:linePitch="360"/>
     </w:sectPr>
@@ -770,7 +880,8 @@
     <w:rsid w:val="00FC693F"/>
     <w:rPr>
       <w:rFonts w:ascii="Aptos" w:hAnsi="Aptos"/>
-      <w:sz w:val="21"/>
+      <w:color w:val="283444"/>
+      <w:sz w:val="20"/>
     </w:rPr>
   </w:style>
   <w:style w:type="paragraph" w:styleId="Header">
@@ -832,11 +943,11 @@
       <w:outlineLvl w:val="0"/>
     </w:pPr>
     <w:rPr>
-      <w:rFonts w:asciiTheme="majorHAnsi" w:eastAsiaTheme="majorEastAsia" w:hAnsiTheme="majorHAnsi" w:cstheme="majorBidi"/>
+      <w:rFonts w:asciiTheme="majorHAnsi" w:eastAsiaTheme="majorEastAsia" w:hAnsiTheme="majorHAnsi" w:cstheme="majorBidi" w:ascii="Aptos Display" w:hAnsi="Aptos Display"/>
       <w:b/>
       <w:bCs/>
-      <w:color w:val="365F91" w:themeColor="accent1" w:themeShade="BF"/>
-      <w:sz w:val="28"/>
+      <w:color w:val="105C68"/>
+      <w:sz w:val="34"/>
       <w:szCs w:val="28"/>
     </w:rPr>
   </w:style>
@@ -856,11 +967,11 @@
       <w:outlineLvl w:val="1"/>
     </w:pPr>
     <w:rPr>
-      <w:rFonts w:asciiTheme="majorHAnsi" w:eastAsiaTheme="majorEastAsia" w:hAnsiTheme="majorHAnsi" w:cstheme="majorBidi"/>
+      <w:rFonts w:asciiTheme="majorHAnsi" w:eastAsiaTheme="majorEastAsia" w:hAnsiTheme="majorHAnsi" w:cstheme="majorBidi" w:ascii="Aptos Display" w:hAnsi="Aptos Display"/>
       <w:b/>
       <w:bCs/>
-      <w:color w:val="4F81BD" w:themeColor="accent1"/>
-      <w:sz w:val="26"/>
+      <w:color w:val="105C68"/>
+      <w:sz w:val="24"/>
       <w:szCs w:val="26"/>
     </w:rPr>
   </w:style>
@@ -1121,11 +1232,12 @@
       <w:contextualSpacing/>
     </w:pPr>
     <w:rPr>
-      <w:rFonts w:asciiTheme="majorHAnsi" w:eastAsiaTheme="majorEastAsia" w:hAnsiTheme="majorHAnsi" w:cstheme="majorBidi"/>
-      <w:color w:val="17365D" w:themeColor="text2" w:themeShade="BF"/>
+      <w:rFonts w:asciiTheme="majorHAnsi" w:eastAsiaTheme="majorEastAsia" w:hAnsiTheme="majorHAnsi" w:cstheme="majorBidi" w:ascii="Aptos Display" w:hAnsi="Aptos Display"/>
+      <w:b/>
+      <w:color w:val="162B44"/>
       <w:spacing w:val="5"/>
       <w:kern w:val="28"/>
-      <w:sz w:val="52"/>
+      <w:sz w:val="50"/>
       <w:szCs w:val="52"/>
     </w:rPr>
   </w:style>

</xml_diff>